<commit_message>
feat: add infinite scroll functionality to DataTable and update load controls
</commit_message>
<xml_diff>
--- a/apps/sis-next/public/templates/PAYROLL_WORD_TEMPLATE.docx
+++ b/apps/sis-next/public/templates/PAYROLL_WORD_TEMPLATE.docx
@@ -44,7 +44,7 @@
           </mc:Choice>
           <mc:Fallback>
             <w:drawing>
-              <wp:anchor distT="0" distB="0" distL="114300" distR="114300" simplePos="0" relativeHeight="251659264" behindDoc="0" locked="0" layoutInCell="1" allowOverlap="1" wp14:anchorId="4FFD9732" wp14:editId="50C6EE66">
+              <wp:anchor distT="0" distB="0" distL="114300" distR="114300" simplePos="0" relativeHeight="251659264" behindDoc="0" locked="0" layoutInCell="1" allowOverlap="1" wp14:anchorId="6F4A66AF" wp14:editId="6E16B7F1">
                 <wp:simplePos x="0" y="0"/>
                 <wp:positionH relativeFrom="column">
                   <wp:posOffset>2495550</wp:posOffset>
@@ -170,21 +170,7 @@
         <w:rPr>
           <w:rFonts w:ascii="Arial" w:hAnsi="Arial" w:cs="Arial"/>
         </w:rPr>
-        <w:t>-</w:t>
-      </w:r>
-      <w:proofErr w:type="spellStart"/>
-      <w:r>
-        <w:rPr>
-          <w:rFonts w:ascii="Arial" w:hAnsi="Arial" w:cs="Arial"/>
-        </w:rPr>
-        <w:t>oOo</w:t>
-      </w:r>
-      <w:proofErr w:type="spellEnd"/>
-      <w:r>
-        <w:rPr>
-          <w:rFonts w:ascii="Arial" w:hAnsi="Arial" w:cs="Arial"/>
-        </w:rPr>
-        <w:t>-</w:t>
+        <w:t>-oOo-</w:t>
       </w:r>
     </w:p>
     <w:p>
@@ -210,25 +196,7 @@
           <w:i/>
           <w:iCs/>
         </w:rPr>
-        <w:t xml:space="preserve">Office </w:t>
-      </w:r>
-      <w:proofErr w:type="gramStart"/>
-      <w:r>
-        <w:rPr>
-          <w:rFonts w:ascii="Arial" w:hAnsi="Arial" w:cs="Arial"/>
-          <w:i/>
-          <w:iCs/>
-        </w:rPr>
-        <w:t>of  the</w:t>
-      </w:r>
-      <w:proofErr w:type="gramEnd"/>
-      <w:r>
-        <w:rPr>
-          <w:rFonts w:ascii="Arial" w:hAnsi="Arial" w:cs="Arial"/>
-          <w:i/>
-          <w:iCs/>
-        </w:rPr>
-        <w:t xml:space="preserve"> City Mayor</w:t>
+        <w:t>Office of  the City Mayor</w:t>
       </w:r>
     </w:p>
     <w:p>
@@ -262,25 +230,7 @@
           <w:i/>
           <w:iCs/>
         </w:rPr>
-        <w:t xml:space="preserve"> {</w:t>
-      </w:r>
-      <w:proofErr w:type="spellStart"/>
-      <w:r>
-        <w:rPr>
-          <w:rFonts w:ascii="Arial" w:hAnsi="Arial" w:cs="Arial"/>
-          <w:i/>
-          <w:iCs/>
-        </w:rPr>
-        <w:t>date_of_filing</w:t>
-      </w:r>
-      <w:proofErr w:type="spellEnd"/>
-      <w:r>
-        <w:rPr>
-          <w:rFonts w:ascii="Arial" w:hAnsi="Arial" w:cs="Arial"/>
-          <w:i/>
-          <w:iCs/>
-        </w:rPr>
-        <w:t>}</w:t>
+        <w:t xml:space="preserve"> {date_of_filing}</w:t>
       </w:r>
     </w:p>
     <w:p>
@@ -362,7 +312,7 @@
       <w:tblPr>
         <w:tblW w:w="102.0%" w:type="pct"/>
         <w:tblLayout w:type="fixed"/>
-        <w:tblLook w:firstRow="0" w:lastRow="0" w:firstColumn="0" w:lastColumn="0" w:noHBand="0" w:noVBand="0"/>
+        <w:tblLook w:firstRow="1" w:lastRow="0" w:firstColumn="1" w:lastColumn="0" w:noHBand="0" w:noVBand="1"/>
       </w:tblPr>
       <w:tblGrid>
         <w:gridCol w:w="576"/>
@@ -2160,35 +2110,7 @@
         <w:rPr>
           <w:rFonts w:ascii="Arial" w:hAnsi="Arial" w:cs="Arial"/>
         </w:rPr>
-        <w:t xml:space="preserve">- - - - - - - - - - - - - - - - - - - - - - - - - - - - - - - - - - - - - - - - - - - - - - - - - - </w:t>
-      </w:r>
-      <w:proofErr w:type="gramStart"/>
-      <w:r>
-        <w:rPr>
-          <w:rFonts w:ascii="Arial" w:hAnsi="Arial" w:cs="Arial"/>
-        </w:rPr>
-        <w:t>-  -</w:t>
-      </w:r>
-      <w:proofErr w:type="gramEnd"/>
-      <w:r>
-        <w:rPr>
-          <w:rFonts w:ascii="Arial" w:hAnsi="Arial" w:cs="Arial"/>
-        </w:rPr>
-        <w:t xml:space="preserve"> - - - - - </w:t>
-      </w:r>
-      <w:proofErr w:type="gramStart"/>
-      <w:r>
-        <w:rPr>
-          <w:rFonts w:ascii="Arial" w:hAnsi="Arial" w:cs="Arial"/>
-        </w:rPr>
-        <w:t>-  -</w:t>
-      </w:r>
-      <w:proofErr w:type="gramEnd"/>
-      <w:r>
-        <w:rPr>
-          <w:rFonts w:ascii="Arial" w:hAnsi="Arial" w:cs="Arial"/>
-        </w:rPr>
-        <w:t xml:space="preserve"> </w:t>
+        <w:t xml:space="preserve">- - - - - - - - - - - - - - - - - - - - - - - - - - - - - - - - - - - - - - - - - - - - - - - - - - -  - - - - - - -  - </w:t>
       </w:r>
     </w:p>
     <w:p>
@@ -2249,25 +2171,7 @@
           <w:b/>
           <w:bCs/>
         </w:rPr>
-        <w:t>{</w:t>
-      </w:r>
-      <w:proofErr w:type="spellStart"/>
-      <w:r>
-        <w:rPr>
-          <w:rFonts w:ascii="Arial" w:hAnsi="Arial" w:cs="Arial"/>
-          <w:b/>
-          <w:bCs/>
-        </w:rPr>
-        <w:t>sem_number</w:t>
-      </w:r>
-      <w:proofErr w:type="spellEnd"/>
-      <w:r>
-        <w:rPr>
-          <w:rFonts w:ascii="Arial" w:hAnsi="Arial" w:cs="Arial"/>
-          <w:b/>
-          <w:bCs/>
-        </w:rPr>
-        <w:t>}</w:t>
+        <w:t>{sem_number}</w:t>
       </w:r>
       <w:r>
         <w:rPr>
@@ -2281,25 +2185,7 @@
           <w:b/>
           <w:bCs/>
         </w:rPr>
-        <w:t>{</w:t>
-      </w:r>
-      <w:proofErr w:type="spellStart"/>
-      <w:r>
-        <w:rPr>
-          <w:rFonts w:ascii="Arial" w:hAnsi="Arial" w:cs="Arial"/>
-          <w:b/>
-          <w:bCs/>
-        </w:rPr>
-        <w:t>school_year</w:t>
-      </w:r>
-      <w:proofErr w:type="spellEnd"/>
-      <w:r>
-        <w:rPr>
-          <w:rFonts w:ascii="Arial" w:hAnsi="Arial" w:cs="Arial"/>
-          <w:b/>
-          <w:bCs/>
-        </w:rPr>
-        <w:t>}</w:t>
+        <w:t>{school_year}</w:t>
       </w:r>
       <w:r>
         <w:rPr>
@@ -2784,7 +2670,6 @@
   <w:style w:type="table" w:default="1" w:styleId="TableNormal">
     <w:name w:val="Normal Table"/>
     <w:uiPriority w:val="99"/>
-    <w:semiHidden/>
     <w:unhideWhenUsed/>
     <w:tblPr>
       <w:tblInd w:w="0pt" w:type="dxa"/>

</xml_diff>